<commit_message>
fix(minuta): passagem de servico entre oficiais so no 1o GBM (Art. 69 da publicavel)
Nas demais OBM o Comandante do SGBM apenas conduz a solenidade, sem passagem
de servico a ele (paragrafo unico novo no se-art-61). Nota do artigo e
deliberacao de 16/09 ajustadas; docx da publicavel e do comparativo regenerados.

Co-Authored-By: Claude Fable 5.1 <noreply@anthropic.com>
</commit_message>
<xml_diff>
--- a/docs/sei/2026-09-11-regulamento-servico/Comparativo_Consulta_Regulamento_de_Servico.docx
+++ b/docs/sei/2026-09-11-regulamento-servico/Comparativo_Consulta_Regulamento_de_Servico.docx
@@ -14237,82 +14237,97 @@
                 <w:sz w:val="20"/>
                 <w:szCs w:val="20"/>
               </w:rPr>
-              <w:t xml:space="preserve">A passagem de serviço, presidida pelo Oficial de Dia no 1º Grupamento de Bombeiro Militar e, nas demais Organizações Bombeiro Militar, pelo Comandante do Subgrupamento de Bombeiro Militar, deverá ser assim realizada:</w:t>
-            </w:r>
-          </w:p>
-          <w:p>
-            <w:pPr>
-              <w:spacing w:after="0"/>
-            </w:pPr>
-            <w:r>
-              <w:rPr>
-                <w:rFonts w:ascii="Times New Roman" w:cs="Times New Roman" w:eastAsia="Times New Roman" w:hAnsi="Times New Roman"/>
-                <w:b w:val="false"/>
-                <w:bCs w:val="false"/>
-                <w:sz w:val="20"/>
-                <w:szCs w:val="20"/>
-              </w:rPr>
-              <w:t xml:space="preserve">I - o Oficial de Dia/Comandante do SGBM que sai posicionado em posição intermediária de defronte a tropa comanda “para passagem de serviço – sentido”;</w:t>
-            </w:r>
-          </w:p>
-          <w:p>
-            <w:pPr>
-              <w:spacing w:after="0"/>
-            </w:pPr>
-            <w:r>
-              <w:rPr>
-                <w:rFonts w:ascii="Times New Roman" w:cs="Times New Roman" w:eastAsia="Times New Roman" w:hAnsi="Times New Roman"/>
-                <w:b w:val="false"/>
-                <w:bCs w:val="false"/>
-                <w:sz w:val="20"/>
-                <w:szCs w:val="20"/>
-              </w:rPr>
-              <w:t xml:space="preserve">II - o Oficial de Dia/Comandante do SGBM que entra tomará o mesmo procedimento previsto no item anterior;</w:t>
-            </w:r>
-          </w:p>
-          <w:p>
-            <w:pPr>
-              <w:spacing w:after="0"/>
-            </w:pPr>
-            <w:r>
-              <w:rPr>
-                <w:rFonts w:ascii="Times New Roman" w:cs="Times New Roman" w:eastAsia="Times New Roman" w:hAnsi="Times New Roman"/>
-                <w:b w:val="false"/>
-                <w:bCs w:val="false"/>
-                <w:sz w:val="20"/>
-                <w:szCs w:val="20"/>
-              </w:rPr>
-              <w:t xml:space="preserve">III - o Oficial de Dia/Comandante do SGBM que sai comanda: “para os Comandantes de Guarnições, um passo em frente, marche”. Tal ato será também comandado pelo Oficial de Dia/Comandante do SGBM que entra;</w:t>
-            </w:r>
-          </w:p>
-          <w:p>
-            <w:pPr>
-              <w:spacing w:after="0"/>
-            </w:pPr>
-            <w:r>
-              <w:rPr>
-                <w:rFonts w:ascii="Times New Roman" w:cs="Times New Roman" w:eastAsia="Times New Roman" w:hAnsi="Times New Roman"/>
-                <w:b w:val="false"/>
-                <w:bCs w:val="false"/>
-                <w:sz w:val="20"/>
-                <w:szCs w:val="20"/>
-              </w:rPr>
-              <w:t xml:space="preserve">IV - em seguida cada Comandante que sai, de acordo com o dispositivo anteriormente descrito, alternadamente passará o serviço ao seu substituto, relatando verbalmente todas as alterações verificadas em seu socorro; e</w:t>
-            </w:r>
-          </w:p>
-          <w:p>
-            <w:pPr>
-              <w:spacing w:after="0"/>
-            </w:pPr>
-            <w:r>
-              <w:rPr>
-                <w:rFonts w:ascii="Times New Roman" w:cs="Times New Roman" w:eastAsia="Times New Roman" w:hAnsi="Times New Roman"/>
-                <w:b w:val="false"/>
-                <w:bCs w:val="false"/>
-                <w:sz w:val="20"/>
-                <w:szCs w:val="20"/>
-              </w:rPr>
-              <w:t xml:space="preserve">V - apresentados todos os Comandantes de Guarnição e passadas todas as alterações existentes, o Oficial de Dia/Comandante do SGBM que sai se apresenta passando o serviço ao Oficial de Dia/Comandante do SGBM que entra. a. O Oficial de Dia/Comandante do SGBM que entra comandará: - “Em continência ao terreno apresentar armas”, b. O Oficial de Dia/Comandante do SGBM que sai comandará: - “Apresentar armas” c. Em seguida, o Oficial de Dia/Comandante do SGBM que entra comandará: -“Descansar armas”, repetindo o mesmo o Oficial de Dia/Comandante do SGBM que sai, d. Por fim, ambos comandarão: - “Descansar”.</w:t>
+              <w:t xml:space="preserve">A passagem de serviço, presidida pelo Oficial de Dia no 1º Grupamento de Bombeiro Militar e conduzida, nas demais Organizações Bombeiro Militar, pelo Comandante do Subgrupamento de Bombeiro Militar, deverá ser assim realizada:</w:t>
+            </w:r>
+          </w:p>
+          <w:p>
+            <w:pPr>
+              <w:spacing w:after="0"/>
+            </w:pPr>
+            <w:r>
+              <w:rPr>
+                <w:rFonts w:ascii="Times New Roman" w:cs="Times New Roman" w:eastAsia="Times New Roman" w:hAnsi="Times New Roman"/>
+                <w:b w:val="false"/>
+                <w:bCs w:val="false"/>
+                <w:sz w:val="20"/>
+                <w:szCs w:val="20"/>
+              </w:rPr>
+              <w:t xml:space="preserve">I - o Oficial de Dia que sai ou, nas demais Organizações Bombeiro Militar, o Comandante do SGBM, posicionado em posição intermediária defronte à tropa, comanda “para passagem de serviço – sentido”;</w:t>
+            </w:r>
+          </w:p>
+          <w:p>
+            <w:pPr>
+              <w:spacing w:after="0"/>
+            </w:pPr>
+            <w:r>
+              <w:rPr>
+                <w:rFonts w:ascii="Times New Roman" w:cs="Times New Roman" w:eastAsia="Times New Roman" w:hAnsi="Times New Roman"/>
+                <w:b w:val="false"/>
+                <w:bCs w:val="false"/>
+                <w:sz w:val="20"/>
+                <w:szCs w:val="20"/>
+              </w:rPr>
+              <w:t xml:space="preserve">II - no 1º Grupamento de Bombeiro Militar, o Oficial de Dia que entra tomará o mesmo procedimento previsto no item anterior;</w:t>
+            </w:r>
+          </w:p>
+          <w:p>
+            <w:pPr>
+              <w:spacing w:after="0"/>
+            </w:pPr>
+            <w:r>
+              <w:rPr>
+                <w:rFonts w:ascii="Times New Roman" w:cs="Times New Roman" w:eastAsia="Times New Roman" w:hAnsi="Times New Roman"/>
+                <w:b w:val="false"/>
+                <w:bCs w:val="false"/>
+                <w:sz w:val="20"/>
+                <w:szCs w:val="20"/>
+              </w:rPr>
+              <w:t xml:space="preserve">III - o Oficial de Dia que sai ou o Comandante do SGBM comanda: “para os Comandantes de Guarnições, um passo em frente, marche”. No 1º Grupamento de Bombeiro Militar, tal ato será também comandado pelo Oficial de Dia que entra;</w:t>
+            </w:r>
+          </w:p>
+          <w:p>
+            <w:pPr>
+              <w:spacing w:after="0"/>
+            </w:pPr>
+            <w:r>
+              <w:rPr>
+                <w:rFonts w:ascii="Times New Roman" w:cs="Times New Roman" w:eastAsia="Times New Roman" w:hAnsi="Times New Roman"/>
+                <w:b w:val="false"/>
+                <w:bCs w:val="false"/>
+                <w:sz w:val="20"/>
+                <w:szCs w:val="20"/>
+              </w:rPr>
+              <w:t xml:space="preserve">IV - em seguida cada Comandante que sai, de acordo com o dispositivo anteriormente descrito, alternadamente passará o serviço ao seu substituto, relatando verbalmente todas as alterações verificadas em seu socorro;</w:t>
+            </w:r>
+          </w:p>
+          <w:p>
+            <w:pPr>
+              <w:spacing w:after="0"/>
+            </w:pPr>
+            <w:r>
+              <w:rPr>
+                <w:rFonts w:ascii="Times New Roman" w:cs="Times New Roman" w:eastAsia="Times New Roman" w:hAnsi="Times New Roman"/>
+                <w:b w:val="false"/>
+                <w:bCs w:val="false"/>
+                <w:sz w:val="20"/>
+                <w:szCs w:val="20"/>
+              </w:rPr>
+              <w:t xml:space="preserve">V - no 1º Grupamento de Bombeiro Militar, apresentados todos os Comandantes de Guarnição e passadas todas as alterações existentes, o Oficial de Dia que sai se apresenta passando o serviço ao Oficial de Dia que entra. a. O Oficial de Dia que entra comandará: - “Em continência ao terreno apresentar armas”, b. O Oficial de Dia que sai comandará: - “Apresentar armas” c. Em seguida, o Oficial de Dia que entra comandará: -“Descansar armas”, repetindo o mesmo o Oficial de Dia que sai, d. Por fim, ambos comandarão: - “Descansar”; e</w:t>
+            </w:r>
+          </w:p>
+          <w:p>
+            <w:pPr>
+              <w:spacing w:after="0"/>
+            </w:pPr>
+            <w:r>
+              <w:rPr>
+                <w:rFonts w:ascii="Times New Roman" w:cs="Times New Roman" w:eastAsia="Times New Roman" w:hAnsi="Times New Roman"/>
+                <w:b w:val="false"/>
+                <w:bCs w:val="false"/>
+                <w:sz w:val="20"/>
+                <w:szCs w:val="20"/>
+              </w:rPr>
+              <w:t xml:space="preserve">Parágrafo único. Nas demais Organizações Bombeiro Militar, o Comandante do SGBM apenas conduz a solenidade, não havendo passagem de serviço a ele; o ato encerra-se com a passagem do serviço entre os Comandantes de Guarnição, na forma do inciso IV.</w:t>
             </w:r>
           </w:p>
         </w:tc>

</xml_diff>

<commit_message>
feat(minuta): capitulo do Superior de Dia reorganizado (Arts. 52-59 da publicavel)
Abre com abrangencia estadual/sobreaviso 24 h/postos e competencias; Comandante
do COB I coordena servico, escala e permutas (sem gabinete do Subcomando-Geral);
se-art-24 passa a tratar so das obrigacoes durante o servico. Redundancias do
sobreaviso removidas. Alteracoes so na versao atual; nada suprimido.

Co-Authored-By: Claude Fable 5.1 <noreply@anthropic.com>
</commit_message>
<xml_diff>
--- a/docs/sei/2026-09-11-regulamento-servico/Comparativo_Consulta_Regulamento_de_Servico.docx
+++ b/docs/sei/2026-09-11-regulamento-servico/Comparativo_Consulta_Regulamento_de_Servico.docx
@@ -7652,7 +7652,7 @@
           <w:sz w:val="18"/>
           <w:szCs w:val="18"/>
         </w:rPr>
-        <w:t xml:space="preserve">texto final (Texto final fechado na curadoria do Portal de Legislação CBM (ago/2026) sobre a LOB, Lei nº 2.204/2009)</w:t>
+        <w:t xml:space="preserve">redação (Revisão de texto da Minuta do Regulamento de Serviço (lote de 16/09/2026) sobre a LOB, Lei nº 2.204/2009)</w:t>
       </w:r>
     </w:p>
     <w:tbl>
@@ -7808,37 +7808,37 @@
                 <w:sz w:val="20"/>
                 <w:szCs w:val="20"/>
               </w:rPr>
-              <w:t xml:space="preserve">O serviço de Superior de Dia será realizado em regime de sobreaviso de 24 (vinte e quatro) horas, devendo o Oficial escalado não se ausentar da área de sua residência e permanecer com o telefone celular funcional ligado durante todo o dia de serviço ou outro meio de comunicação o qual deverá ser informado ao Comandante do COB I.</w:t>
-            </w:r>
-          </w:p>
-          <w:p>
-            <w:pPr>
-              <w:spacing w:after="0"/>
-            </w:pPr>
-            <w:r>
-              <w:rPr>
-                <w:rFonts w:ascii="Times New Roman" w:cs="Times New Roman" w:eastAsia="Times New Roman" w:hAnsi="Times New Roman"/>
-                <w:b w:val="false"/>
-                <w:bCs w:val="false"/>
-                <w:sz w:val="20"/>
-                <w:szCs w:val="20"/>
-              </w:rPr>
-              <w:t xml:space="preserve">§ 1º Ao final do serviço deverá assinar, via Sistema Eletrônico de Informações - SEI, juntamente com o Oficial de Dia a Parte Diária.</w:t>
-            </w:r>
-          </w:p>
-          <w:p>
-            <w:pPr>
-              <w:spacing w:after="0"/>
-            </w:pPr>
-            <w:r>
-              <w:rPr>
-                <w:rFonts w:ascii="Times New Roman" w:cs="Times New Roman" w:eastAsia="Times New Roman" w:hAnsi="Times New Roman"/>
-                <w:b w:val="false"/>
-                <w:bCs w:val="false"/>
-                <w:sz w:val="20"/>
-                <w:szCs w:val="20"/>
-              </w:rPr>
-              <w:t xml:space="preserve">§ 2º O regime do serviço poderá sofrer alterações mediante publicação em Boletim Geral por determinação do Comandante-Geral ou pelo Subcomandante-Geral em virtude das necessidades do momento.</w:t>
+              <w:t xml:space="preserve">Durante o período de serviço, o Superior de Dia não deverá se ausentar da área de sua residência, permanecendo em condições de pronto acionamento, com o telefone celular funcional ligado ou outro meio de comunicação que permita seu imediato contato e comparecimento, o qual deverá ser informado ao Comandante do COB I.</w:t>
+            </w:r>
+          </w:p>
+          <w:p>
+            <w:pPr>
+              <w:spacing w:after="0"/>
+            </w:pPr>
+            <w:r>
+              <w:rPr>
+                <w:rFonts w:ascii="Times New Roman" w:cs="Times New Roman" w:eastAsia="Times New Roman" w:hAnsi="Times New Roman"/>
+                <w:b w:val="false"/>
+                <w:bCs w:val="false"/>
+                <w:sz w:val="20"/>
+                <w:szCs w:val="20"/>
+              </w:rPr>
+              <w:t xml:space="preserve">§ 1º Ao final do serviço, o Superior de Dia deverá assinar, via Sistema Eletrônico de Informações - SEI, juntamente com o Oficial de Dia, a Parte Diária.</w:t>
+            </w:r>
+          </w:p>
+          <w:p>
+            <w:pPr>
+              <w:spacing w:after="0"/>
+            </w:pPr>
+            <w:r>
+              <w:rPr>
+                <w:rFonts w:ascii="Times New Roman" w:cs="Times New Roman" w:eastAsia="Times New Roman" w:hAnsi="Times New Roman"/>
+                <w:b w:val="false"/>
+                <w:bCs w:val="false"/>
+                <w:sz w:val="20"/>
+                <w:szCs w:val="20"/>
+              </w:rPr>
+              <w:t xml:space="preserve">§ 2º O regime do serviço poderá sofrer alterações, mediante publicação em Boletim Geral, por determinação do Comandante-Geral ou do Comandante do COB I, em virtude das necessidades do momento.</w:t>
             </w:r>
           </w:p>
         </w:tc>
@@ -8008,7 +8008,7 @@
                 <w:sz w:val="20"/>
                 <w:szCs w:val="20"/>
               </w:rPr>
-              <w:t xml:space="preserve">A permuta de serviço do Superior de Dia, só será permitida mediante autorização por escrito do Comandante do COB I, via Sistema Eletrônico de Informações - SEI.</w:t>
+              <w:t xml:space="preserve">A permuta de serviço do Superior de Dia só será permitida mediante autorização por escrito do Comandante do COB I, via Sistema Eletrônico de Informações - SEI.</w:t>
             </w:r>
           </w:p>
         </w:tc>
@@ -8052,7 +8052,7 @@
           <w:sz w:val="18"/>
           <w:szCs w:val="18"/>
         </w:rPr>
-        <w:t xml:space="preserve">texto final (Texto final fechado na curadoria do Portal de Legislação CBM (ago/2026) sobre a LOB, Lei nº 2.204/2009)</w:t>
+        <w:t xml:space="preserve">redação (Revisão de texto da Minuta do Regulamento de Serviço (lote de 16/09/2026) sobre a LOB, Lei nº 2.204/2009)</w:t>
       </w:r>
     </w:p>
     <w:tbl>
@@ -8193,7 +8193,7 @@
                 <w:sz w:val="20"/>
                 <w:szCs w:val="20"/>
               </w:rPr>
-              <w:t xml:space="preserve">O serviço diário de Superior de Dia ao CBMRO será coordenado pelo Comandante do COB I, através do gabinete do Subcomando-Geral.</w:t>
+              <w:t xml:space="preserve">O serviço de Superior de Dia será coordenado pelo Comandante do COB I.</w:t>
             </w:r>
           </w:p>
           <w:p>
@@ -8252,7 +8252,7 @@
           <w:sz w:val="18"/>
           <w:szCs w:val="18"/>
         </w:rPr>
-        <w:t xml:space="preserve">texto final (Texto final fechado na curadoria do Portal de Legislação CBM (ago/2026) sobre a LOB, Lei nº 2.204/2009)</w:t>
+        <w:t xml:space="preserve">redação (Revisão de texto da Minuta do Regulamento de Serviço (lote de 16/09/2026) sobre a LOB, Lei nº 2.204/2009)</w:t>
       </w:r>
     </w:p>
     <w:tbl>
@@ -8378,7 +8378,7 @@
                 <w:sz w:val="20"/>
                 <w:szCs w:val="20"/>
               </w:rPr>
-              <w:t xml:space="preserve">O regime da escala de serviços diários de Superior de Dia obedecerá ao critério de dias corridos, podendo, a critério do Subcomandante-Geral ser alterado.</w:t>
+              <w:t xml:space="preserve">O regime da escala de serviços diários de Superior de Dia obedecerá ao critério de dias corridos, podendo, a critério do Comandante do COB I, ser alterado.</w:t>
             </w:r>
           </w:p>
         </w:tc>
@@ -8592,7 +8592,7 @@
           <w:sz w:val="18"/>
           <w:szCs w:val="18"/>
         </w:rPr>
-        <w:t xml:space="preserve">Deliberação de 15/09/2026: mantido o alcance estadual do Superior de Dia (área de atuação do artigo anterior); o texto de partida sugerido na consulta restringia o serviço à Capital. Postos de Major e Tenente-Coronel conforme a sugestão.</w:t>
+        <w:t xml:space="preserve">Deliberação de 15/09/2026: mantido o alcance estadual do Superior de Dia; o texto de partida sugerido na consulta restringia o serviço à Capital. Postos de Major e Tenente-Coronel conforme a sugestão. Revisão de 16/09/2026: abre o capítulo na minuta publicável; o parágrafo sobre o meio de comunicação saiu por duplicidade com o artigo das obrigações durante o serviço.</w:t>
       </w:r>
     </w:p>
     <w:tbl>
@@ -8733,22 +8733,7 @@
                 <w:sz w:val="20"/>
                 <w:szCs w:val="20"/>
               </w:rPr>
-              <w:t xml:space="preserve">§ 1º Durante o período de serviço, o Superior de Dia deverá permanecer em condições de pronto acionamento, mantendo disponível meio de comunicação que permita seu imediato contato e comparecimento quando necessário.</w:t>
-            </w:r>
-          </w:p>
-          <w:p>
-            <w:pPr>
-              <w:spacing w:after="0"/>
-            </w:pPr>
-            <w:r>
-              <w:rPr>
-                <w:rFonts w:ascii="Times New Roman" w:cs="Times New Roman" w:eastAsia="Times New Roman" w:hAnsi="Times New Roman"/>
-                <w:b w:val="false"/>
-                <w:bCs w:val="false"/>
-                <w:sz w:val="20"/>
-                <w:szCs w:val="20"/>
-              </w:rPr>
-              <w:t xml:space="preserve">§ 2º A atuação do Superior de Dia observará as competências próprias do Comando Operacional de Bombeiros e dos Comandantes das Organizações Bombeiro Militar.</w:t>
+              <w:t xml:space="preserve">Parágrafo único. A atuação do Superior de Dia observará as competências próprias do Comando Operacional de Bombeiros e dos Comandantes das Organizações Bombeiro Militar.</w:t>
             </w:r>
           </w:p>
         </w:tc>

</xml_diff>

<commit_message>
feat(minuta): competencias do Oficial de Dia consolidadas em 17 incisos (Art. 62 da publicavel)
Fundidos os incisos duplicados (servicos internos/guarda, inspecoes/conservacao,
acesso de pessoas/viaturas, comunicacao de ocorrencias/acidentes, crime
militar/flagrante); retirado o que repetia o par. 1o do artigo do regime;
"presidir a passagem de servico" no inciso I. Artigo novo da versao atual.

Co-Authored-By: Claude Fable 5.1 <noreply@anthropic.com>
</commit_message>
<xml_diff>
--- a/docs/sei/2026-09-11-regulamento-servico/Comparativo_Consulta_Regulamento_de_Servico.docx
+++ b/docs/sei/2026-09-11-regulamento-servico/Comparativo_Consulta_Regulamento_de_Servico.docx
@@ -9479,7 +9479,7 @@
           <w:sz w:val="18"/>
           <w:szCs w:val="18"/>
         </w:rPr>
-        <w:t xml:space="preserve">Incisos X e XIII chegaram truncados na sugestão original ("rviço;" e "durante o se"); completados por dedução — confirmar com o autor. Incisos XXII a XXIV: conferir com a Corregedoria quanto ao CPPM.</w:t>
+        <w:t xml:space="preserve">Revisão de 16/09/2026 (Art. 62 da publicável): 24 incisos consolidados em 17 — fundidos III/V/VII, IV/XXI, X/XI, XV/XX e XXIII/XXIV; o antigo VI (zelar pela disciplina, segurança e ordem) saiu por repetir o § 1º do artigo anterior; o I passa a "presidir a passagem de serviço" (coerente com o capítulo da passagem de serviço) e o último inciso deixa de se limitar ao serviço interno. Incisos XV e XVI: conferir com a Corregedoria quanto ao regulamento disciplinar e ao CPPM.</w:t>
       </w:r>
     </w:p>
     <w:tbl>
@@ -9620,7 +9620,7 @@
                 <w:sz w:val="20"/>
                 <w:szCs w:val="20"/>
               </w:rPr>
-              <w:t xml:space="preserve">I - participar das solenidades, formaturas e demais atos regulamentares previstos para o início e término do serviço;</w:t>
+              <w:t xml:space="preserve">I - presidir a passagem de serviço e participar das demais solenidades, formaturas e atos regulamentares previstos para o início e o término do serviço;</w:t>
             </w:r>
           </w:p>
           <w:p>
@@ -9650,322 +9650,217 @@
                 <w:sz w:val="20"/>
                 <w:szCs w:val="20"/>
               </w:rPr>
-              <w:t xml:space="preserve">III - orientar os militares empregados nos serviços internos do quartel quanto às suas atribuições e às determinações em vigor;</w:t>
-            </w:r>
-          </w:p>
-          <w:p>
-            <w:pPr>
-              <w:spacing w:after="0"/>
-            </w:pPr>
-            <w:r>
-              <w:rPr>
-                <w:rFonts w:ascii="Times New Roman" w:cs="Times New Roman" w:eastAsia="Times New Roman" w:hAnsi="Times New Roman"/>
-                <w:b w:val="false"/>
-                <w:bCs w:val="false"/>
-                <w:sz w:val="20"/>
-                <w:szCs w:val="20"/>
-              </w:rPr>
-              <w:t xml:space="preserve">IV - realizar inspeções nas dependências do quartel, adotando ou solicitando as providências necessárias diante das irregularidades constatadas;</w:t>
-            </w:r>
-          </w:p>
-          <w:p>
-            <w:pPr>
-              <w:spacing w:after="0"/>
-            </w:pPr>
-            <w:r>
-              <w:rPr>
-                <w:rFonts w:ascii="Times New Roman" w:cs="Times New Roman" w:eastAsia="Times New Roman" w:hAnsi="Times New Roman"/>
-                <w:b w:val="false"/>
-                <w:bCs w:val="false"/>
-                <w:sz w:val="20"/>
-                <w:szCs w:val="20"/>
-              </w:rPr>
-              <w:t xml:space="preserve">V - fiscalizar os serviços internos, verificando o cumprimento das normas, ordens e determinações em vigor;</w:t>
-            </w:r>
-          </w:p>
-          <w:p>
-            <w:pPr>
-              <w:spacing w:after="0"/>
-            </w:pPr>
-            <w:r>
-              <w:rPr>
-                <w:rFonts w:ascii="Times New Roman" w:cs="Times New Roman" w:eastAsia="Times New Roman" w:hAnsi="Times New Roman"/>
-                <w:b w:val="false"/>
-                <w:bCs w:val="false"/>
-                <w:sz w:val="20"/>
-                <w:szCs w:val="20"/>
-              </w:rPr>
-              <w:t xml:space="preserve">VI - zelar pela disciplina, segurança e ordem no interior do quartel;</w:t>
-            </w:r>
-          </w:p>
-          <w:p>
-            <w:pPr>
-              <w:spacing w:after="0"/>
-            </w:pPr>
-            <w:r>
-              <w:rPr>
-                <w:rFonts w:ascii="Times New Roman" w:cs="Times New Roman" w:eastAsia="Times New Roman" w:hAnsi="Times New Roman"/>
-                <w:b w:val="false"/>
-                <w:bCs w:val="false"/>
-                <w:sz w:val="20"/>
-                <w:szCs w:val="20"/>
-              </w:rPr>
-              <w:t xml:space="preserve">VII - fiscalizar os serviços de guarda e segurança do aquartelamento;</w:t>
-            </w:r>
-          </w:p>
-          <w:p>
-            <w:pPr>
-              <w:spacing w:after="0"/>
-            </w:pPr>
-            <w:r>
-              <w:rPr>
-                <w:rFonts w:ascii="Times New Roman" w:cs="Times New Roman" w:eastAsia="Times New Roman" w:hAnsi="Times New Roman"/>
-                <w:b w:val="false"/>
-                <w:bCs w:val="false"/>
-                <w:sz w:val="20"/>
-                <w:szCs w:val="20"/>
-              </w:rPr>
-              <w:t xml:space="preserve">VIII - certificar-se de que as dependências que devam permanecer fechadas estejam devidamente resguardadas, mantendo o controle das respectivas chaves nos termos das normas internas;</w:t>
-            </w:r>
-          </w:p>
-          <w:p>
-            <w:pPr>
-              <w:spacing w:after="0"/>
-            </w:pPr>
-            <w:r>
-              <w:rPr>
-                <w:rFonts w:ascii="Times New Roman" w:cs="Times New Roman" w:eastAsia="Times New Roman" w:hAnsi="Times New Roman"/>
-                <w:b w:val="false"/>
-                <w:bCs w:val="false"/>
-                <w:sz w:val="20"/>
-                <w:szCs w:val="20"/>
-              </w:rPr>
-              <w:t xml:space="preserve">IX - providenciar, na forma regulamentar, a substituição dos militares que não comparecerem aos serviços internos para os quais estejam escalados;</w:t>
-            </w:r>
-          </w:p>
-          <w:p>
-            <w:pPr>
-              <w:spacing w:after="0"/>
-            </w:pPr>
-            <w:r>
-              <w:rPr>
-                <w:rFonts w:ascii="Times New Roman" w:cs="Times New Roman" w:eastAsia="Times New Roman" w:hAnsi="Times New Roman"/>
-                <w:b w:val="false"/>
-                <w:bCs w:val="false"/>
-                <w:sz w:val="20"/>
-                <w:szCs w:val="20"/>
-              </w:rPr>
-              <w:t xml:space="preserve">X - zelar pelo cumprimento das normas referentes à entrada, saída e permanência de pessoas no quartel;</w:t>
-            </w:r>
-          </w:p>
-          <w:p>
-            <w:pPr>
-              <w:spacing w:after="0"/>
-            </w:pPr>
-            <w:r>
-              <w:rPr>
-                <w:rFonts w:ascii="Times New Roman" w:cs="Times New Roman" w:eastAsia="Times New Roman" w:hAnsi="Times New Roman"/>
-                <w:b w:val="false"/>
-                <w:bCs w:val="false"/>
-                <w:sz w:val="20"/>
-                <w:szCs w:val="20"/>
-              </w:rPr>
-              <w:t xml:space="preserve">XI - fiscalizar a entrada e saída de viaturas do aquartelamento, observadas as normas estabelecidas;</w:t>
-            </w:r>
-          </w:p>
-          <w:p>
-            <w:pPr>
-              <w:spacing w:after="0"/>
-            </w:pPr>
-            <w:r>
-              <w:rPr>
-                <w:rFonts w:ascii="Times New Roman" w:cs="Times New Roman" w:eastAsia="Times New Roman" w:hAnsi="Times New Roman"/>
-                <w:b w:val="false"/>
-                <w:bCs w:val="false"/>
-                <w:sz w:val="20"/>
-                <w:szCs w:val="20"/>
-              </w:rPr>
-              <w:t xml:space="preserve">XII - registrar a entrada ou saída de materiais do quartel fora do horário de expediente, não permitindo sua retirada sem a devida autorização;</w:t>
-            </w:r>
-          </w:p>
-          <w:p>
-            <w:pPr>
-              <w:spacing w:after="0"/>
-            </w:pPr>
-            <w:r>
-              <w:rPr>
-                <w:rFonts w:ascii="Times New Roman" w:cs="Times New Roman" w:eastAsia="Times New Roman" w:hAnsi="Times New Roman"/>
-                <w:b w:val="false"/>
-                <w:bCs w:val="false"/>
-                <w:sz w:val="20"/>
-                <w:szCs w:val="20"/>
-              </w:rPr>
-              <w:t xml:space="preserve">XIII - zelar pelos materiais, armamentos, instalações e demais bens que estejam sob sua responsabilidade durante o serviço;</w:t>
-            </w:r>
-          </w:p>
-          <w:p>
-            <w:pPr>
-              <w:spacing w:after="0"/>
-            </w:pPr>
-            <w:r>
-              <w:rPr>
-                <w:rFonts w:ascii="Times New Roman" w:cs="Times New Roman" w:eastAsia="Times New Roman" w:hAnsi="Times New Roman"/>
-                <w:b w:val="false"/>
-                <w:bCs w:val="false"/>
-                <w:sz w:val="20"/>
-                <w:szCs w:val="20"/>
-              </w:rPr>
-              <w:t xml:space="preserve">XIV - receber autoridades civis e militares que compareçam ao quartel fora do horário de expediente, adotando as providências protocolares cabíveis;</w:t>
-            </w:r>
-          </w:p>
-          <w:p>
-            <w:pPr>
-              <w:spacing w:after="0"/>
-            </w:pPr>
-            <w:r>
-              <w:rPr>
-                <w:rFonts w:ascii="Times New Roman" w:cs="Times New Roman" w:eastAsia="Times New Roman" w:hAnsi="Times New Roman"/>
-                <w:b w:val="false"/>
-                <w:bCs w:val="false"/>
-                <w:sz w:val="20"/>
-                <w:szCs w:val="20"/>
-              </w:rPr>
-              <w:t xml:space="preserve">XV - comunicar imediatamente à autoridade competente as ocorrências extraordinárias verificadas durante o serviço, especialmente aquelas relacionadas à disciplina, segurança, pessoal ou patrimônio;</w:t>
-            </w:r>
-          </w:p>
-          <w:p>
-            <w:pPr>
-              <w:spacing w:after="0"/>
-            </w:pPr>
-            <w:r>
-              <w:rPr>
-                <w:rFonts w:ascii="Times New Roman" w:cs="Times New Roman" w:eastAsia="Times New Roman" w:hAnsi="Times New Roman"/>
-                <w:b w:val="false"/>
-                <w:bCs w:val="false"/>
-                <w:sz w:val="20"/>
-                <w:szCs w:val="20"/>
-              </w:rPr>
-              <w:t xml:space="preserve">XVI - adotar as providências imediatas destinadas a sanar ou minimizar alterações verificadas no funcionamento interno do quartel, submetendo à autoridade competente aquelas que excedam sua atribuição;</w:t>
-            </w:r>
-          </w:p>
-          <w:p>
-            <w:pPr>
-              <w:spacing w:after="0"/>
-            </w:pPr>
-            <w:r>
-              <w:rPr>
-                <w:rFonts w:ascii="Times New Roman" w:cs="Times New Roman" w:eastAsia="Times New Roman" w:hAnsi="Times New Roman"/>
-                <w:b w:val="false"/>
-                <w:bCs w:val="false"/>
-                <w:sz w:val="20"/>
-                <w:szCs w:val="20"/>
-              </w:rPr>
-              <w:t xml:space="preserve">XVII - receber e encaminhar, fora do horário de expediente, documentos ou comunicações de caráter urgente, adotando as providências necessárias para que cheguem tempestivamente à autoridade competente;</w:t>
-            </w:r>
-          </w:p>
-          <w:p>
-            <w:pPr>
-              <w:spacing w:after="0"/>
-            </w:pPr>
-            <w:r>
-              <w:rPr>
-                <w:rFonts w:ascii="Times New Roman" w:cs="Times New Roman" w:eastAsia="Times New Roman" w:hAnsi="Times New Roman"/>
-                <w:b w:val="false"/>
-                <w:bCs w:val="false"/>
-                <w:sz w:val="20"/>
-                <w:szCs w:val="20"/>
-              </w:rPr>
-              <w:t xml:space="preserve">XVIII - registrar em Parte Diária, via Sistema Eletrônico de Informações - SEI, as ocorrências e alterações verificadas durante sua jornada de serviço;</w:t>
-            </w:r>
-          </w:p>
-          <w:p>
-            <w:pPr>
-              <w:spacing w:after="0"/>
-            </w:pPr>
-            <w:r>
-              <w:rPr>
-                <w:rFonts w:ascii="Times New Roman" w:cs="Times New Roman" w:eastAsia="Times New Roman" w:hAnsi="Times New Roman"/>
-                <w:b w:val="false"/>
-                <w:bCs w:val="false"/>
-                <w:sz w:val="20"/>
-                <w:szCs w:val="20"/>
-              </w:rPr>
-              <w:t xml:space="preserve">XIX - comunicar imediatamente qualquer acidente envolvendo pessoal, viatura, material ou patrimônio ocorrido no âmbito do quartel;</w:t>
-            </w:r>
-          </w:p>
-          <w:p>
-            <w:pPr>
-              <w:spacing w:after="0"/>
-            </w:pPr>
-            <w:r>
-              <w:rPr>
-                <w:rFonts w:ascii="Times New Roman" w:cs="Times New Roman" w:eastAsia="Times New Roman" w:hAnsi="Times New Roman"/>
-                <w:b w:val="false"/>
-                <w:bCs w:val="false"/>
-                <w:sz w:val="20"/>
-                <w:szCs w:val="20"/>
-              </w:rPr>
-              <w:t xml:space="preserve">XX - fiscalizar as condições de conservação, limpeza e organização das dependências do quartel;</w:t>
-            </w:r>
-          </w:p>
-          <w:p>
-            <w:pPr>
-              <w:spacing w:after="0"/>
-            </w:pPr>
-            <w:r>
-              <w:rPr>
-                <w:rFonts w:ascii="Times New Roman" w:cs="Times New Roman" w:eastAsia="Times New Roman" w:hAnsi="Times New Roman"/>
-                <w:b w:val="false"/>
-                <w:bCs w:val="false"/>
-                <w:sz w:val="20"/>
-                <w:szCs w:val="20"/>
-              </w:rPr>
-              <w:t xml:space="preserve">XXI - fiscalizar o cumprimento das prisões e detenções de natureza disciplinar executadas nas dependências do aquartelamento, zelando pela observância das determinações da autoridade competente, das condições de segurança e das normas aplicáveis;</w:t>
-            </w:r>
-          </w:p>
-          <w:p>
-            <w:pPr>
-              <w:spacing w:after="0"/>
-            </w:pPr>
-            <w:r>
-              <w:rPr>
-                <w:rFonts w:ascii="Times New Roman" w:cs="Times New Roman" w:eastAsia="Times New Roman" w:hAnsi="Times New Roman"/>
-                <w:b w:val="false"/>
-                <w:bCs w:val="false"/>
-                <w:sz w:val="20"/>
-                <w:szCs w:val="20"/>
-              </w:rPr>
-              <w:t xml:space="preserve">XXII - diante da ocorrência de fato que, em tese, constitua crime militar, adotar as providências imediatas destinadas à preservação do local, dos elementos de informação e das provas, quando cabíveis, bem como comunicar imediatamente o fato à autoridade de polícia judiciária militar competente, para adoção das medidas previstas na legislação processual penal militar;</w:t>
-            </w:r>
-          </w:p>
-          <w:p>
-            <w:pPr>
-              <w:spacing w:after="0"/>
-            </w:pPr>
-            <w:r>
-              <w:rPr>
-                <w:rFonts w:ascii="Times New Roman" w:cs="Times New Roman" w:eastAsia="Times New Roman" w:hAnsi="Times New Roman"/>
-                <w:b w:val="false"/>
-                <w:bCs w:val="false"/>
-                <w:sz w:val="20"/>
-                <w:szCs w:val="20"/>
-              </w:rPr>
-              <w:t xml:space="preserve">XXIII - adotar, nas hipóteses de flagrante de crime militar, as providências que lhe competirem nos termos da legislação processual penal militar, comunicando imediatamente o fato à autoridade de polícia judiciária militar competente; e</w:t>
-            </w:r>
-          </w:p>
-          <w:p>
-            <w:pPr>
-              <w:spacing w:after="0"/>
-            </w:pPr>
-            <w:r>
-              <w:rPr>
-                <w:rFonts w:ascii="Times New Roman" w:cs="Times New Roman" w:eastAsia="Times New Roman" w:hAnsi="Times New Roman"/>
-                <w:b w:val="false"/>
-                <w:bCs w:val="false"/>
-                <w:sz w:val="20"/>
-                <w:szCs w:val="20"/>
-              </w:rPr>
-              <w:t xml:space="preserve">XXIV - cumprir e fazer cumprir as ordens e determinações dos escalões superiores relacionadas ao serviço interno do aquartelamento.</w:t>
+              <w:t xml:space="preserve">III - orientar e fiscalizar os militares empregados nos serviços internos do quartel, inclusive nos de guarda e segurança do aquartelamento, quanto às suas atribuições e ao cumprimento das normas, ordens e determinações em vigor;</w:t>
+            </w:r>
+          </w:p>
+          <w:p>
+            <w:pPr>
+              <w:spacing w:after="0"/>
+            </w:pPr>
+            <w:r>
+              <w:rPr>
+                <w:rFonts w:ascii="Times New Roman" w:cs="Times New Roman" w:eastAsia="Times New Roman" w:hAnsi="Times New Roman"/>
+                <w:b w:val="false"/>
+                <w:bCs w:val="false"/>
+                <w:sz w:val="20"/>
+                <w:szCs w:val="20"/>
+              </w:rPr>
+              <w:t xml:space="preserve">IV - realizar inspeções nas dependências do quartel, verificando as condições de conservação, limpeza, organização e segurança e adotando ou solicitando as providências necessárias diante das irregularidades constatadas;</w:t>
+            </w:r>
+          </w:p>
+          <w:p>
+            <w:pPr>
+              <w:spacing w:after="0"/>
+            </w:pPr>
+            <w:r>
+              <w:rPr>
+                <w:rFonts w:ascii="Times New Roman" w:cs="Times New Roman" w:eastAsia="Times New Roman" w:hAnsi="Times New Roman"/>
+                <w:b w:val="false"/>
+                <w:bCs w:val="false"/>
+                <w:sz w:val="20"/>
+                <w:szCs w:val="20"/>
+              </w:rPr>
+              <w:t xml:space="preserve">V - certificar-se de que as dependências que devam permanecer fechadas estejam devidamente resguardadas, mantendo o controle das respectivas chaves nos termos das normas internas;</w:t>
+            </w:r>
+          </w:p>
+          <w:p>
+            <w:pPr>
+              <w:spacing w:after="0"/>
+            </w:pPr>
+            <w:r>
+              <w:rPr>
+                <w:rFonts w:ascii="Times New Roman" w:cs="Times New Roman" w:eastAsia="Times New Roman" w:hAnsi="Times New Roman"/>
+                <w:b w:val="false"/>
+                <w:bCs w:val="false"/>
+                <w:sz w:val="20"/>
+                <w:szCs w:val="20"/>
+              </w:rPr>
+              <w:t xml:space="preserve">VI - providenciar, na forma regulamentar, a substituição dos militares que não comparecerem aos serviços internos para os quais estejam escalados;</w:t>
+            </w:r>
+          </w:p>
+          <w:p>
+            <w:pPr>
+              <w:spacing w:after="0"/>
+            </w:pPr>
+            <w:r>
+              <w:rPr>
+                <w:rFonts w:ascii="Times New Roman" w:cs="Times New Roman" w:eastAsia="Times New Roman" w:hAnsi="Times New Roman"/>
+                <w:b w:val="false"/>
+                <w:bCs w:val="false"/>
+                <w:sz w:val="20"/>
+                <w:szCs w:val="20"/>
+              </w:rPr>
+              <w:t xml:space="preserve">VII - controlar, observadas as normas em vigor, a entrada, a saída e a permanência de pessoas e a entrada e a saída de viaturas no quartel;</w:t>
+            </w:r>
+          </w:p>
+          <w:p>
+            <w:pPr>
+              <w:spacing w:after="0"/>
+            </w:pPr>
+            <w:r>
+              <w:rPr>
+                <w:rFonts w:ascii="Times New Roman" w:cs="Times New Roman" w:eastAsia="Times New Roman" w:hAnsi="Times New Roman"/>
+                <w:b w:val="false"/>
+                <w:bCs w:val="false"/>
+                <w:sz w:val="20"/>
+                <w:szCs w:val="20"/>
+              </w:rPr>
+              <w:t xml:space="preserve">VIII - registrar a entrada ou a saída de materiais do quartel fora do horário de expediente, não permitindo sua retirada sem a devida autorização;</w:t>
+            </w:r>
+          </w:p>
+          <w:p>
+            <w:pPr>
+              <w:spacing w:after="0"/>
+            </w:pPr>
+            <w:r>
+              <w:rPr>
+                <w:rFonts w:ascii="Times New Roman" w:cs="Times New Roman" w:eastAsia="Times New Roman" w:hAnsi="Times New Roman"/>
+                <w:b w:val="false"/>
+                <w:bCs w:val="false"/>
+                <w:sz w:val="20"/>
+                <w:szCs w:val="20"/>
+              </w:rPr>
+              <w:t xml:space="preserve">IX - zelar pelos materiais, armamentos, instalações e demais bens que estejam sob sua responsabilidade durante o serviço;</w:t>
+            </w:r>
+          </w:p>
+          <w:p>
+            <w:pPr>
+              <w:spacing w:after="0"/>
+            </w:pPr>
+            <w:r>
+              <w:rPr>
+                <w:rFonts w:ascii="Times New Roman" w:cs="Times New Roman" w:eastAsia="Times New Roman" w:hAnsi="Times New Roman"/>
+                <w:b w:val="false"/>
+                <w:bCs w:val="false"/>
+                <w:sz w:val="20"/>
+                <w:szCs w:val="20"/>
+              </w:rPr>
+              <w:t xml:space="preserve">X - receber autoridades civis e militares que compareçam ao quartel fora do horário de expediente, adotando as providências protocolares cabíveis;</w:t>
+            </w:r>
+          </w:p>
+          <w:p>
+            <w:pPr>
+              <w:spacing w:after="0"/>
+            </w:pPr>
+            <w:r>
+              <w:rPr>
+                <w:rFonts w:ascii="Times New Roman" w:cs="Times New Roman" w:eastAsia="Times New Roman" w:hAnsi="Times New Roman"/>
+                <w:b w:val="false"/>
+                <w:bCs w:val="false"/>
+                <w:sz w:val="20"/>
+                <w:szCs w:val="20"/>
+              </w:rPr>
+              <w:t xml:space="preserve">XI - receber e encaminhar, fora do horário de expediente, documentos ou comunicações de caráter urgente, adotando as providências necessárias para que cheguem tempestivamente à autoridade competente;</w:t>
+            </w:r>
+          </w:p>
+          <w:p>
+            <w:pPr>
+              <w:spacing w:after="0"/>
+            </w:pPr>
+            <w:r>
+              <w:rPr>
+                <w:rFonts w:ascii="Times New Roman" w:cs="Times New Roman" w:eastAsia="Times New Roman" w:hAnsi="Times New Roman"/>
+                <w:b w:val="false"/>
+                <w:bCs w:val="false"/>
+                <w:sz w:val="20"/>
+                <w:szCs w:val="20"/>
+              </w:rPr>
+              <w:t xml:space="preserve">XII - comunicar imediatamente à autoridade competente as ocorrências extraordinárias verificadas durante o serviço, especialmente as relacionadas à disciplina, à segurança, ao pessoal ou ao patrimônio, inclusive os acidentes envolvendo pessoal, viaturas, material ou patrimônio ocorridos no âmbito do quartel;</w:t>
+            </w:r>
+          </w:p>
+          <w:p>
+            <w:pPr>
+              <w:spacing w:after="0"/>
+            </w:pPr>
+            <w:r>
+              <w:rPr>
+                <w:rFonts w:ascii="Times New Roman" w:cs="Times New Roman" w:eastAsia="Times New Roman" w:hAnsi="Times New Roman"/>
+                <w:b w:val="false"/>
+                <w:bCs w:val="false"/>
+                <w:sz w:val="20"/>
+                <w:szCs w:val="20"/>
+              </w:rPr>
+              <w:t xml:space="preserve">XIII - adotar as providências imediatas destinadas a sanar ou minimizar alterações verificadas no funcionamento interno do quartel, submetendo à autoridade competente aquelas que excedam sua atribuição;</w:t>
+            </w:r>
+          </w:p>
+          <w:p>
+            <w:pPr>
+              <w:spacing w:after="0"/>
+            </w:pPr>
+            <w:r>
+              <w:rPr>
+                <w:rFonts w:ascii="Times New Roman" w:cs="Times New Roman" w:eastAsia="Times New Roman" w:hAnsi="Times New Roman"/>
+                <w:b w:val="false"/>
+                <w:bCs w:val="false"/>
+                <w:sz w:val="20"/>
+                <w:szCs w:val="20"/>
+              </w:rPr>
+              <w:t xml:space="preserve">XIV - registrar em Parte Diária, via Sistema Eletrônico de Informações - SEI, as ocorrências e alterações verificadas durante sua jornada de serviço;</w:t>
+            </w:r>
+          </w:p>
+          <w:p>
+            <w:pPr>
+              <w:spacing w:after="0"/>
+            </w:pPr>
+            <w:r>
+              <w:rPr>
+                <w:rFonts w:ascii="Times New Roman" w:cs="Times New Roman" w:eastAsia="Times New Roman" w:hAnsi="Times New Roman"/>
+                <w:b w:val="false"/>
+                <w:bCs w:val="false"/>
+                <w:sz w:val="20"/>
+                <w:szCs w:val="20"/>
+              </w:rPr>
+              <w:t xml:space="preserve">XV - fiscalizar o cumprimento das prisões e detenções de natureza disciplinar executadas nas dependências do aquartelamento, zelando pela observância das determinações da autoridade competente, das condições de segurança e das normas aplicáveis;</w:t>
+            </w:r>
+          </w:p>
+          <w:p>
+            <w:pPr>
+              <w:spacing w:after="0"/>
+            </w:pPr>
+            <w:r>
+              <w:rPr>
+                <w:rFonts w:ascii="Times New Roman" w:cs="Times New Roman" w:eastAsia="Times New Roman" w:hAnsi="Times New Roman"/>
+                <w:b w:val="false"/>
+                <w:bCs w:val="false"/>
+                <w:sz w:val="20"/>
+                <w:szCs w:val="20"/>
+              </w:rPr>
+              <w:t xml:space="preserve">XVI - diante de fato que, em tese, constitua crime militar, adotar as providências imediatas destinadas à preservação do local, dos elementos de informação e das provas e, nas hipóteses de flagrante, as que lhe competirem nos termos da legislação processual penal militar, comunicando imediatamente o fato à autoridade de polícia judiciária militar competente; e</w:t>
+            </w:r>
+          </w:p>
+          <w:p>
+            <w:pPr>
+              <w:spacing w:after="0"/>
+            </w:pPr>
+            <w:r>
+              <w:rPr>
+                <w:rFonts w:ascii="Times New Roman" w:cs="Times New Roman" w:eastAsia="Times New Roman" w:hAnsi="Times New Roman"/>
+                <w:b w:val="false"/>
+                <w:bCs w:val="false"/>
+                <w:sz w:val="20"/>
+                <w:szCs w:val="20"/>
+              </w:rPr>
+              <w:t xml:space="preserve">XVII - cumprir e fazer cumprir as ordens e determinações dos escalões superiores relacionadas ao serviço.</w:t>
             </w:r>
           </w:p>
         </w:tc>

</xml_diff>

<commit_message>
fix(docx): formatacao dos dispositivos conforme o Manual de Redacao oficial
Recuo de primeira linha de 2,5 cm em todos os dispositivos (artigos com
paragrafos/incisos saiam sem recuo), sem recuo de bloco, espacamento simples
com 6 pt apos, margens 3/1,5/2/2 cm. Regras centralizadas em docxFormato.js,
usadas pela publicavel, consulta, comparativo e docx do Regulamento Geral.

Co-Authored-By: Claude Fable 5.1 <noreply@anthropic.com>
</commit_message>
<xml_diff>
--- a/docs/sei/2026-09-11-regulamento-servico/Comparativo_Consulta_Regulamento_de_Servico.docx
+++ b/docs/sei/2026-09-11-regulamento-servico/Comparativo_Consulta_Regulamento_de_Servico.docx
@@ -121,8 +121,8 @@
     </w:p>
     <w:p>
       <w:pPr>
-        <w:spacing w:after="240" w:line="360"/>
-        <w:ind w:firstLine="708"/>
+        <w:spacing w:after="240" w:line="240"/>
+        <w:ind w:firstLine="1417"/>
         <w:jc w:val="both"/>
       </w:pPr>
       <w:r>
@@ -158,7 +158,7 @@
     </w:p>
     <w:p>
       <w:pPr>
-        <w:spacing w:after="120" w:line="360"/>
+        <w:spacing w:after="120" w:line="240"/>
         <w:jc w:val="both"/>
       </w:pPr>
       <w:r>
@@ -176,7 +176,7 @@
     </w:p>
     <w:p>
       <w:pPr>
-        <w:spacing w:after="40" w:line="360"/>
+        <w:spacing w:after="40" w:line="240"/>
         <w:jc w:val="both"/>
       </w:pPr>
       <w:r>
@@ -328,7 +328,7 @@
     </w:p>
     <w:p>
       <w:pPr>
-        <w:spacing w:after="40" w:line="360"/>
+        <w:spacing w:after="40" w:line="240"/>
         <w:jc w:val="both"/>
       </w:pPr>
       <w:r>
@@ -1233,7 +1233,7 @@
     </w:p>
     <w:p>
       <w:pPr>
-        <w:spacing w:after="120" w:line="360"/>
+        <w:spacing w:after="120" w:line="240"/>
         <w:jc w:val="both"/>
       </w:pPr>
       <w:r>
@@ -1251,7 +1251,7 @@
     </w:p>
     <w:p>
       <w:pPr>
-        <w:spacing w:after="40" w:line="360"/>
+        <w:spacing w:after="40" w:line="240"/>
         <w:jc w:val="both"/>
       </w:pPr>
       <w:r>
@@ -1658,7 +1658,7 @@
     </w:p>
     <w:p>
       <w:pPr>
-        <w:spacing w:after="40" w:line="360"/>
+        <w:spacing w:after="40" w:line="240"/>
         <w:jc w:val="both"/>
       </w:pPr>
       <w:r>
@@ -1676,7 +1676,7 @@
     </w:p>
     <w:p>
       <w:pPr>
-        <w:spacing w:after="60" w:line="360"/>
+        <w:spacing w:after="60" w:line="240"/>
         <w:jc w:val="both"/>
       </w:pPr>
       <w:r>
@@ -2173,7 +2173,7 @@
     </w:p>
     <w:p>
       <w:pPr>
-        <w:spacing w:after="40" w:line="360"/>
+        <w:spacing w:after="40" w:line="240"/>
         <w:jc w:val="both"/>
       </w:pPr>
       <w:r>
@@ -2191,7 +2191,7 @@
     </w:p>
     <w:p>
       <w:pPr>
-        <w:spacing w:after="60" w:line="360"/>
+        <w:spacing w:after="60" w:line="240"/>
         <w:jc w:val="both"/>
       </w:pPr>
       <w:r>
@@ -2538,7 +2538,7 @@
     </w:p>
     <w:p>
       <w:pPr>
-        <w:spacing w:after="40" w:line="360"/>
+        <w:spacing w:after="40" w:line="240"/>
         <w:jc w:val="both"/>
       </w:pPr>
       <w:r>
@@ -2556,7 +2556,7 @@
     </w:p>
     <w:p>
       <w:pPr>
-        <w:spacing w:after="60" w:line="360"/>
+        <w:spacing w:after="60" w:line="240"/>
         <w:jc w:val="both"/>
       </w:pPr>
       <w:r>
@@ -2873,7 +2873,7 @@
     </w:p>
     <w:p>
       <w:pPr>
-        <w:spacing w:after="40" w:line="360"/>
+        <w:spacing w:after="40" w:line="240"/>
         <w:jc w:val="both"/>
       </w:pPr>
       <w:r>
@@ -3205,7 +3205,7 @@
     </w:p>
     <w:p>
       <w:pPr>
-        <w:spacing w:after="40" w:line="360"/>
+        <w:spacing w:after="40" w:line="240"/>
         <w:jc w:val="both"/>
       </w:pPr>
       <w:r>
@@ -3447,7 +3447,7 @@
     </w:p>
     <w:p>
       <w:pPr>
-        <w:spacing w:after="40" w:line="360"/>
+        <w:spacing w:after="40" w:line="240"/>
         <w:jc w:val="both"/>
       </w:pPr>
       <w:r>
@@ -3764,7 +3764,7 @@
     </w:p>
     <w:p>
       <w:pPr>
-        <w:spacing w:after="40" w:line="360"/>
+        <w:spacing w:after="40" w:line="240"/>
         <w:jc w:val="both"/>
       </w:pPr>
       <w:r>
@@ -4096,7 +4096,7 @@
     </w:p>
     <w:p>
       <w:pPr>
-        <w:spacing w:after="40" w:line="360"/>
+        <w:spacing w:after="40" w:line="240"/>
         <w:jc w:val="both"/>
       </w:pPr>
       <w:r>
@@ -4114,7 +4114,7 @@
     </w:p>
     <w:p>
       <w:pPr>
-        <w:spacing w:after="60" w:line="360"/>
+        <w:spacing w:after="60" w:line="240"/>
         <w:jc w:val="both"/>
       </w:pPr>
       <w:r>
@@ -4416,7 +4416,7 @@
     </w:p>
     <w:p>
       <w:pPr>
-        <w:spacing w:after="40" w:line="360"/>
+        <w:spacing w:after="40" w:line="240"/>
         <w:jc w:val="both"/>
       </w:pPr>
       <w:r>
@@ -4434,7 +4434,7 @@
     </w:p>
     <w:p>
       <w:pPr>
-        <w:spacing w:after="60" w:line="360"/>
+        <w:spacing w:after="60" w:line="240"/>
         <w:jc w:val="both"/>
       </w:pPr>
       <w:r>
@@ -4811,7 +4811,7 @@
     </w:p>
     <w:p>
       <w:pPr>
-        <w:spacing w:after="40" w:line="360"/>
+        <w:spacing w:after="40" w:line="240"/>
         <w:jc w:val="both"/>
       </w:pPr>
       <w:r>
@@ -5248,7 +5248,7 @@
     </w:p>
     <w:p>
       <w:pPr>
-        <w:spacing w:after="40" w:line="360"/>
+        <w:spacing w:after="40" w:line="240"/>
         <w:jc w:val="both"/>
       </w:pPr>
       <w:r>
@@ -5266,7 +5266,7 @@
     </w:p>
     <w:p>
       <w:pPr>
-        <w:spacing w:after="60" w:line="360"/>
+        <w:spacing w:after="60" w:line="240"/>
         <w:jc w:val="both"/>
       </w:pPr>
       <w:r>
@@ -5766,7 +5766,7 @@
     </w:p>
     <w:p>
       <w:pPr>
-        <w:spacing w:after="120" w:line="360"/>
+        <w:spacing w:after="120" w:line="240"/>
         <w:jc w:val="both"/>
       </w:pPr>
       <w:r>
@@ -5784,7 +5784,7 @@
     </w:p>
     <w:p>
       <w:pPr>
-        <w:spacing w:after="40" w:line="360"/>
+        <w:spacing w:after="40" w:line="240"/>
         <w:jc w:val="both"/>
       </w:pPr>
       <w:r>
@@ -5802,7 +5802,7 @@
     </w:p>
     <w:p>
       <w:pPr>
-        <w:spacing w:after="60" w:line="360"/>
+        <w:spacing w:after="60" w:line="240"/>
         <w:jc w:val="both"/>
       </w:pPr>
       <w:r>
@@ -5954,7 +5954,7 @@
     </w:p>
     <w:p>
       <w:pPr>
-        <w:spacing w:after="40" w:line="360"/>
+        <w:spacing w:after="40" w:line="240"/>
         <w:jc w:val="both"/>
       </w:pPr>
       <w:r>
@@ -5972,7 +5972,7 @@
     </w:p>
     <w:p>
       <w:pPr>
-        <w:spacing w:after="60" w:line="360"/>
+        <w:spacing w:after="60" w:line="240"/>
         <w:jc w:val="both"/>
       </w:pPr>
       <w:r>
@@ -6349,7 +6349,7 @@
     </w:p>
     <w:p>
       <w:pPr>
-        <w:spacing w:after="40" w:line="360"/>
+        <w:spacing w:after="40" w:line="240"/>
         <w:jc w:val="both"/>
       </w:pPr>
       <w:r>
@@ -6816,7 +6816,7 @@
     </w:p>
     <w:p>
       <w:pPr>
-        <w:spacing w:after="40" w:line="360"/>
+        <w:spacing w:after="40" w:line="240"/>
         <w:jc w:val="both"/>
       </w:pPr>
       <w:r>
@@ -6834,7 +6834,7 @@
     </w:p>
     <w:p>
       <w:pPr>
-        <w:spacing w:after="60" w:line="360"/>
+        <w:spacing w:after="60" w:line="240"/>
         <w:jc w:val="both"/>
       </w:pPr>
       <w:r>
@@ -7211,7 +7211,7 @@
     </w:p>
     <w:p>
       <w:pPr>
-        <w:spacing w:after="40" w:line="360"/>
+        <w:spacing w:after="40" w:line="240"/>
         <w:jc w:val="both"/>
       </w:pPr>
       <w:r>
@@ -7229,7 +7229,7 @@
     </w:p>
     <w:p>
       <w:pPr>
-        <w:spacing w:after="60" w:line="360"/>
+        <w:spacing w:after="60" w:line="240"/>
         <w:jc w:val="both"/>
       </w:pPr>
       <w:r>
@@ -7621,7 +7621,7 @@
     </w:p>
     <w:p>
       <w:pPr>
-        <w:spacing w:after="40" w:line="360"/>
+        <w:spacing w:after="40" w:line="240"/>
         <w:jc w:val="both"/>
       </w:pPr>
       <w:r>
@@ -7639,7 +7639,7 @@
     </w:p>
     <w:p>
       <w:pPr>
-        <w:spacing w:after="60" w:line="360"/>
+        <w:spacing w:after="60" w:line="240"/>
         <w:jc w:val="both"/>
       </w:pPr>
       <w:r>
@@ -7851,7 +7851,7 @@
     </w:p>
     <w:p>
       <w:pPr>
-        <w:spacing w:after="40" w:line="360"/>
+        <w:spacing w:after="40" w:line="240"/>
         <w:jc w:val="both"/>
       </w:pPr>
       <w:r>
@@ -7869,7 +7869,7 @@
     </w:p>
     <w:p>
       <w:pPr>
-        <w:spacing w:after="60" w:line="360"/>
+        <w:spacing w:after="60" w:line="240"/>
         <w:jc w:val="both"/>
       </w:pPr>
       <w:r>
@@ -8021,7 +8021,7 @@
     </w:p>
     <w:p>
       <w:pPr>
-        <w:spacing w:after="40" w:line="360"/>
+        <w:spacing w:after="40" w:line="240"/>
         <w:jc w:val="both"/>
       </w:pPr>
       <w:r>
@@ -8039,7 +8039,7 @@
     </w:p>
     <w:p>
       <w:pPr>
-        <w:spacing w:after="60" w:line="360"/>
+        <w:spacing w:after="60" w:line="240"/>
         <w:jc w:val="both"/>
       </w:pPr>
       <w:r>
@@ -8221,7 +8221,7 @@
     </w:p>
     <w:p>
       <w:pPr>
-        <w:spacing w:after="40" w:line="360"/>
+        <w:spacing w:after="40" w:line="240"/>
         <w:jc w:val="both"/>
       </w:pPr>
       <w:r>
@@ -8239,7 +8239,7 @@
     </w:p>
     <w:p>
       <w:pPr>
-        <w:spacing w:after="60" w:line="360"/>
+        <w:spacing w:after="60" w:line="240"/>
         <w:jc w:val="both"/>
       </w:pPr>
       <w:r>
@@ -8391,7 +8391,7 @@
     </w:p>
     <w:p>
       <w:pPr>
-        <w:spacing w:after="40" w:line="360"/>
+        <w:spacing w:after="40" w:line="240"/>
         <w:jc w:val="both"/>
       </w:pPr>
       <w:r>
@@ -8409,7 +8409,7 @@
     </w:p>
     <w:p>
       <w:pPr>
-        <w:spacing w:after="60" w:line="360"/>
+        <w:spacing w:after="60" w:line="240"/>
         <w:jc w:val="both"/>
       </w:pPr>
       <w:r>
@@ -8561,7 +8561,7 @@
     </w:p>
     <w:p>
       <w:pPr>
-        <w:spacing w:after="40" w:line="360"/>
+        <w:spacing w:after="40" w:line="240"/>
         <w:jc w:val="both"/>
       </w:pPr>
       <w:r>
@@ -8579,7 +8579,7 @@
     </w:p>
     <w:p>
       <w:pPr>
-        <w:spacing w:after="60" w:line="360"/>
+        <w:spacing w:after="60" w:line="240"/>
         <w:jc w:val="both"/>
       </w:pPr>
       <w:r>
@@ -8746,7 +8746,7 @@
     </w:p>
     <w:p>
       <w:pPr>
-        <w:spacing w:after="40" w:line="360"/>
+        <w:spacing w:after="40" w:line="240"/>
         <w:jc w:val="both"/>
       </w:pPr>
       <w:r>
@@ -9078,7 +9078,7 @@
     </w:p>
     <w:p>
       <w:pPr>
-        <w:spacing w:after="40" w:line="360"/>
+        <w:spacing w:after="40" w:line="240"/>
         <w:jc w:val="both"/>
       </w:pPr>
       <w:r>
@@ -9096,7 +9096,7 @@
     </w:p>
     <w:p>
       <w:pPr>
-        <w:spacing w:after="60" w:line="360"/>
+        <w:spacing w:after="60" w:line="240"/>
         <w:jc w:val="both"/>
       </w:pPr>
       <w:r>
@@ -9248,7 +9248,7 @@
     </w:p>
     <w:p>
       <w:pPr>
-        <w:spacing w:after="40" w:line="360"/>
+        <w:spacing w:after="40" w:line="240"/>
         <w:jc w:val="both"/>
       </w:pPr>
       <w:r>
@@ -9266,7 +9266,7 @@
     </w:p>
     <w:p>
       <w:pPr>
-        <w:spacing w:after="60" w:line="360"/>
+        <w:spacing w:after="60" w:line="240"/>
         <w:jc w:val="both"/>
       </w:pPr>
       <w:r>
@@ -9448,7 +9448,7 @@
     </w:p>
     <w:p>
       <w:pPr>
-        <w:spacing w:after="40" w:line="360"/>
+        <w:spacing w:after="40" w:line="240"/>
         <w:jc w:val="both"/>
       </w:pPr>
       <w:r>
@@ -9466,7 +9466,7 @@
     </w:p>
     <w:p>
       <w:pPr>
-        <w:spacing w:after="60" w:line="360"/>
+        <w:spacing w:after="60" w:line="240"/>
         <w:jc w:val="both"/>
       </w:pPr>
       <w:r>
@@ -9873,7 +9873,7 @@
     </w:p>
     <w:p>
       <w:pPr>
-        <w:spacing w:after="40" w:line="360"/>
+        <w:spacing w:after="40" w:line="240"/>
         <w:jc w:val="both"/>
       </w:pPr>
       <w:r>
@@ -10025,7 +10025,7 @@
     </w:p>
     <w:p>
       <w:pPr>
-        <w:spacing w:after="40" w:line="360"/>
+        <w:spacing w:after="40" w:line="240"/>
         <w:jc w:val="both"/>
       </w:pPr>
       <w:r>
@@ -10177,7 +10177,7 @@
     </w:p>
     <w:p>
       <w:pPr>
-        <w:spacing w:after="40" w:line="360"/>
+        <w:spacing w:after="40" w:line="240"/>
         <w:jc w:val="both"/>
       </w:pPr>
       <w:r>
@@ -10195,7 +10195,7 @@
     </w:p>
     <w:p>
       <w:pPr>
-        <w:spacing w:after="60" w:line="360"/>
+        <w:spacing w:after="60" w:line="240"/>
         <w:jc w:val="both"/>
       </w:pPr>
       <w:r>
@@ -10527,7 +10527,7 @@
     </w:p>
     <w:p>
       <w:pPr>
-        <w:spacing w:after="40" w:line="360"/>
+        <w:spacing w:after="40" w:line="240"/>
         <w:jc w:val="both"/>
       </w:pPr>
       <w:r>
@@ -10679,7 +10679,7 @@
     </w:p>
     <w:p>
       <w:pPr>
-        <w:spacing w:after="40" w:line="360"/>
+        <w:spacing w:after="40" w:line="240"/>
         <w:jc w:val="both"/>
       </w:pPr>
       <w:r>
@@ -10831,7 +10831,7 @@
     </w:p>
     <w:p>
       <w:pPr>
-        <w:spacing w:after="40" w:line="360"/>
+        <w:spacing w:after="40" w:line="240"/>
         <w:jc w:val="both"/>
       </w:pPr>
       <w:r>
@@ -10849,7 +10849,7 @@
     </w:p>
     <w:p>
       <w:pPr>
-        <w:spacing w:after="60" w:line="360"/>
+        <w:spacing w:after="60" w:line="240"/>
         <w:jc w:val="both"/>
       </w:pPr>
       <w:r>
@@ -11241,7 +11241,7 @@
     </w:p>
     <w:p>
       <w:pPr>
-        <w:spacing w:after="40" w:line="360"/>
+        <w:spacing w:after="40" w:line="240"/>
         <w:jc w:val="both"/>
       </w:pPr>
       <w:r>
@@ -11393,7 +11393,7 @@
     </w:p>
     <w:p>
       <w:pPr>
-        <w:spacing w:after="40" w:line="360"/>
+        <w:spacing w:after="40" w:line="240"/>
         <w:jc w:val="both"/>
       </w:pPr>
       <w:r>
@@ -11545,7 +11545,7 @@
     </w:p>
     <w:p>
       <w:pPr>
-        <w:spacing w:after="40" w:line="360"/>
+        <w:spacing w:after="40" w:line="240"/>
         <w:jc w:val="both"/>
       </w:pPr>
       <w:r>
@@ -11563,7 +11563,7 @@
     </w:p>
     <w:p>
       <w:pPr>
-        <w:spacing w:after="60" w:line="360"/>
+        <w:spacing w:after="60" w:line="240"/>
         <w:jc w:val="both"/>
       </w:pPr>
       <w:r>
@@ -11715,7 +11715,7 @@
     </w:p>
     <w:p>
       <w:pPr>
-        <w:spacing w:after="40" w:line="360"/>
+        <w:spacing w:after="40" w:line="240"/>
         <w:jc w:val="both"/>
       </w:pPr>
       <w:r>
@@ -11733,7 +11733,7 @@
     </w:p>
     <w:p>
       <w:pPr>
-        <w:spacing w:after="60" w:line="360"/>
+        <w:spacing w:after="60" w:line="240"/>
         <w:jc w:val="both"/>
       </w:pPr>
       <w:r>
@@ -11885,7 +11885,7 @@
     </w:p>
     <w:p>
       <w:pPr>
-        <w:spacing w:after="40" w:line="360"/>
+        <w:spacing w:after="40" w:line="240"/>
         <w:jc w:val="both"/>
       </w:pPr>
       <w:r>
@@ -11903,7 +11903,7 @@
     </w:p>
     <w:p>
       <w:pPr>
-        <w:spacing w:after="60" w:line="360"/>
+        <w:spacing w:after="60" w:line="240"/>
         <w:jc w:val="both"/>
       </w:pPr>
       <w:r>
@@ -12385,7 +12385,7 @@
     </w:p>
     <w:p>
       <w:pPr>
-        <w:spacing w:after="40" w:line="360"/>
+        <w:spacing w:after="40" w:line="240"/>
         <w:jc w:val="both"/>
       </w:pPr>
       <w:r>
@@ -12403,7 +12403,7 @@
     </w:p>
     <w:p>
       <w:pPr>
-        <w:spacing w:after="60" w:line="360"/>
+        <w:spacing w:after="60" w:line="240"/>
         <w:jc w:val="both"/>
       </w:pPr>
       <w:r>
@@ -12555,7 +12555,7 @@
     </w:p>
     <w:p>
       <w:pPr>
-        <w:spacing w:after="40" w:line="360"/>
+        <w:spacing w:after="40" w:line="240"/>
         <w:jc w:val="both"/>
       </w:pPr>
       <w:r>
@@ -12573,7 +12573,7 @@
     </w:p>
     <w:p>
       <w:pPr>
-        <w:spacing w:after="60" w:line="360"/>
+        <w:spacing w:after="60" w:line="240"/>
         <w:jc w:val="both"/>
       </w:pPr>
       <w:r>
@@ -12743,7 +12743,7 @@
     </w:p>
     <w:p>
       <w:pPr>
-        <w:spacing w:after="120" w:line="360"/>
+        <w:spacing w:after="120" w:line="240"/>
         <w:jc w:val="both"/>
       </w:pPr>
       <w:r>
@@ -12761,7 +12761,7 @@
     </w:p>
     <w:p>
       <w:pPr>
-        <w:spacing w:after="40" w:line="360"/>
+        <w:spacing w:after="40" w:line="240"/>
         <w:jc w:val="both"/>
       </w:pPr>
       <w:r>
@@ -13183,7 +13183,7 @@
     </w:p>
     <w:p>
       <w:pPr>
-        <w:spacing w:after="40" w:line="360"/>
+        <w:spacing w:after="40" w:line="240"/>
         <w:jc w:val="both"/>
       </w:pPr>
       <w:r>
@@ -13545,7 +13545,7 @@
     </w:p>
     <w:p>
       <w:pPr>
-        <w:spacing w:after="40" w:line="360"/>
+        <w:spacing w:after="40" w:line="240"/>
         <w:jc w:val="both"/>
       </w:pPr>
       <w:r>
@@ -13715,7 +13715,7 @@
     </w:p>
     <w:p>
       <w:pPr>
-        <w:spacing w:after="120" w:line="360"/>
+        <w:spacing w:after="120" w:line="240"/>
         <w:jc w:val="both"/>
       </w:pPr>
       <w:r>
@@ -13733,7 +13733,7 @@
     </w:p>
     <w:p>
       <w:pPr>
-        <w:spacing w:after="40" w:line="360"/>
+        <w:spacing w:after="40" w:line="240"/>
         <w:jc w:val="both"/>
       </w:pPr>
       <w:r>
@@ -13885,7 +13885,7 @@
     </w:p>
     <w:p>
       <w:pPr>
-        <w:spacing w:after="40" w:line="360"/>
+        <w:spacing w:after="40" w:line="240"/>
         <w:jc w:val="both"/>
       </w:pPr>
       <w:r>
@@ -13903,7 +13903,7 @@
     </w:p>
     <w:p>
       <w:pPr>
-        <w:spacing w:after="60" w:line="360"/>
+        <w:spacing w:after="60" w:line="240"/>
         <w:jc w:val="both"/>
       </w:pPr>
       <w:r>
@@ -14220,7 +14220,7 @@
     </w:p>
     <w:p>
       <w:pPr>
-        <w:spacing w:after="40" w:line="360"/>
+        <w:spacing w:after="40" w:line="240"/>
         <w:jc w:val="both"/>
       </w:pPr>
       <w:r>
@@ -14238,7 +14238,7 @@
     </w:p>
     <w:p>
       <w:pPr>
-        <w:spacing w:after="60" w:line="360"/>
+        <w:spacing w:after="60" w:line="240"/>
         <w:jc w:val="both"/>
       </w:pPr>
       <w:r>
@@ -14390,7 +14390,7 @@
     </w:p>
     <w:p>
       <w:pPr>
-        <w:spacing w:after="40" w:line="360"/>
+        <w:spacing w:after="40" w:line="240"/>
         <w:jc w:val="both"/>
       </w:pPr>
       <w:r>
@@ -14408,7 +14408,7 @@
     </w:p>
     <w:p>
       <w:pPr>
-        <w:spacing w:after="60" w:line="360"/>
+        <w:spacing w:after="60" w:line="240"/>
         <w:jc w:val="both"/>
       </w:pPr>
       <w:r>
@@ -14560,7 +14560,7 @@
     </w:p>
     <w:p>
       <w:pPr>
-        <w:spacing w:after="40" w:line="360"/>
+        <w:spacing w:after="40" w:line="240"/>
         <w:jc w:val="both"/>
       </w:pPr>
       <w:r>
@@ -14578,7 +14578,7 @@
     </w:p>
     <w:p>
       <w:pPr>
-        <w:spacing w:after="60" w:line="360"/>
+        <w:spacing w:after="60" w:line="240"/>
         <w:jc w:val="both"/>
       </w:pPr>
       <w:r>
@@ -14730,7 +14730,7 @@
     </w:p>
     <w:p>
       <w:pPr>
-        <w:spacing w:after="40" w:line="360"/>
+        <w:spacing w:after="40" w:line="240"/>
         <w:jc w:val="both"/>
       </w:pPr>
       <w:r>
@@ -14748,7 +14748,7 @@
     </w:p>
     <w:p>
       <w:pPr>
-        <w:spacing w:after="60" w:line="360"/>
+        <w:spacing w:after="60" w:line="240"/>
         <w:jc w:val="both"/>
       </w:pPr>
       <w:r>
@@ -14900,7 +14900,7 @@
     </w:p>
     <w:p>
       <w:pPr>
-        <w:spacing w:after="40" w:line="360"/>
+        <w:spacing w:after="40" w:line="240"/>
         <w:jc w:val="both"/>
       </w:pPr>
       <w:r>
@@ -14918,7 +14918,7 @@
     </w:p>
     <w:p>
       <w:pPr>
-        <w:spacing w:after="60" w:line="360"/>
+        <w:spacing w:after="60" w:line="240"/>
         <w:jc w:val="both"/>
       </w:pPr>
       <w:r>
@@ -15070,7 +15070,7 @@
     </w:p>
     <w:p>
       <w:pPr>
-        <w:spacing w:after="40" w:line="360"/>
+        <w:spacing w:after="40" w:line="240"/>
         <w:jc w:val="both"/>
       </w:pPr>
       <w:r>
@@ -15222,7 +15222,7 @@
     </w:p>
     <w:p>
       <w:pPr>
-        <w:spacing w:after="40" w:line="360"/>
+        <w:spacing w:after="40" w:line="240"/>
         <w:jc w:val="both"/>
       </w:pPr>
       <w:r>
@@ -15374,7 +15374,7 @@
     </w:p>
     <w:p>
       <w:pPr>
-        <w:spacing w:after="40" w:line="360"/>
+        <w:spacing w:after="40" w:line="240"/>
         <w:jc w:val="both"/>
       </w:pPr>
       <w:r>
@@ -15392,7 +15392,7 @@
     </w:p>
     <w:p>
       <w:pPr>
-        <w:spacing w:after="60" w:line="360"/>
+        <w:spacing w:after="60" w:line="240"/>
         <w:jc w:val="both"/>
       </w:pPr>
       <w:r>
@@ -15544,7 +15544,7 @@
     </w:p>
     <w:p>
       <w:pPr>
-        <w:spacing w:after="40" w:line="360"/>
+        <w:spacing w:after="40" w:line="240"/>
         <w:jc w:val="both"/>
       </w:pPr>
       <w:r>
@@ -15562,7 +15562,7 @@
     </w:p>
     <w:p>
       <w:pPr>
-        <w:spacing w:after="60" w:line="360"/>
+        <w:spacing w:after="60" w:line="240"/>
         <w:jc w:val="both"/>
       </w:pPr>
       <w:r>
@@ -15714,7 +15714,7 @@
     </w:p>
     <w:p>
       <w:pPr>
-        <w:spacing w:after="40" w:line="360"/>
+        <w:spacing w:after="40" w:line="240"/>
         <w:jc w:val="both"/>
       </w:pPr>
       <w:r>
@@ -15866,7 +15866,7 @@
     </w:p>
     <w:p>
       <w:pPr>
-        <w:spacing w:after="40" w:line="360"/>
+        <w:spacing w:after="40" w:line="240"/>
         <w:jc w:val="both"/>
       </w:pPr>
       <w:r>
@@ -15884,7 +15884,7 @@
     </w:p>
     <w:p>
       <w:pPr>
-        <w:spacing w:after="60" w:line="360"/>
+        <w:spacing w:after="60" w:line="240"/>
         <w:jc w:val="both"/>
       </w:pPr>
       <w:r>
@@ -16036,7 +16036,7 @@
     </w:p>
     <w:p>
       <w:pPr>
-        <w:spacing w:after="40" w:line="360"/>
+        <w:spacing w:after="40" w:line="240"/>
         <w:jc w:val="both"/>
       </w:pPr>
       <w:r>
@@ -16054,7 +16054,7 @@
     </w:p>
     <w:p>
       <w:pPr>
-        <w:spacing w:after="60" w:line="360"/>
+        <w:spacing w:after="60" w:line="240"/>
         <w:jc w:val="both"/>
       </w:pPr>
       <w:r>
@@ -16206,7 +16206,7 @@
     </w:p>
     <w:p>
       <w:pPr>
-        <w:spacing w:after="40" w:line="360"/>
+        <w:spacing w:after="40" w:line="240"/>
         <w:jc w:val="both"/>
       </w:pPr>
       <w:r>
@@ -16224,7 +16224,7 @@
     </w:p>
     <w:p>
       <w:pPr>
-        <w:spacing w:after="60" w:line="360"/>
+        <w:spacing w:after="60" w:line="240"/>
         <w:jc w:val="both"/>
       </w:pPr>
       <w:r>
@@ -16376,7 +16376,7 @@
     </w:p>
     <w:p>
       <w:pPr>
-        <w:spacing w:after="40" w:line="360"/>
+        <w:spacing w:after="40" w:line="240"/>
         <w:jc w:val="both"/>
       </w:pPr>
       <w:r>
@@ -16528,7 +16528,7 @@
     </w:p>
     <w:p>
       <w:pPr>
-        <w:spacing w:after="40" w:line="360"/>
+        <w:spacing w:after="40" w:line="240"/>
         <w:jc w:val="both"/>
       </w:pPr>
       <w:r>
@@ -16546,7 +16546,7 @@
     </w:p>
     <w:p>
       <w:pPr>
-        <w:spacing w:after="60" w:line="360"/>
+        <w:spacing w:after="60" w:line="240"/>
         <w:jc w:val="both"/>
       </w:pPr>
       <w:r>
@@ -16728,7 +16728,7 @@
     </w:p>
     <w:p>
       <w:pPr>
-        <w:spacing w:after="40" w:line="360"/>
+        <w:spacing w:after="40" w:line="240"/>
         <w:jc w:val="both"/>
       </w:pPr>
       <w:r>
@@ -16880,7 +16880,7 @@
     </w:p>
     <w:p>
       <w:pPr>
-        <w:spacing w:after="40" w:line="360"/>
+        <w:spacing w:after="40" w:line="240"/>
         <w:jc w:val="both"/>
       </w:pPr>
       <w:r>
@@ -16898,7 +16898,7 @@
     </w:p>
     <w:p>
       <w:pPr>
-        <w:spacing w:after="60" w:line="360"/>
+        <w:spacing w:after="60" w:line="240"/>
         <w:jc w:val="both"/>
       </w:pPr>
       <w:r>
@@ -17050,7 +17050,7 @@
     </w:p>
     <w:p>
       <w:pPr>
-        <w:spacing w:after="40" w:line="360"/>
+        <w:spacing w:after="40" w:line="240"/>
         <w:jc w:val="both"/>
       </w:pPr>
       <w:r>
@@ -17202,7 +17202,7 @@
     </w:p>
     <w:p>
       <w:pPr>
-        <w:spacing w:after="40" w:line="360"/>
+        <w:spacing w:after="40" w:line="240"/>
         <w:jc w:val="both"/>
       </w:pPr>
       <w:r>
@@ -17354,7 +17354,7 @@
     </w:p>
     <w:p>
       <w:pPr>
-        <w:spacing w:after="40" w:line="360"/>
+        <w:spacing w:after="40" w:line="240"/>
         <w:jc w:val="both"/>
       </w:pPr>
       <w:r>
@@ -17506,7 +17506,7 @@
     </w:p>
     <w:p>
       <w:pPr>
-        <w:spacing w:after="40" w:line="360"/>
+        <w:spacing w:after="40" w:line="240"/>
         <w:jc w:val="both"/>
       </w:pPr>
       <w:r>
@@ -17808,7 +17808,7 @@
     </w:p>
     <w:p>
       <w:pPr>
-        <w:spacing w:after="40" w:line="360"/>
+        <w:spacing w:after="40" w:line="240"/>
         <w:jc w:val="both"/>
       </w:pPr>
       <w:r>
@@ -17978,7 +17978,7 @@
     </w:p>
     <w:p>
       <w:pPr>
-        <w:spacing w:after="120" w:line="360"/>
+        <w:spacing w:after="120" w:line="240"/>
         <w:jc w:val="both"/>
       </w:pPr>
       <w:r>
@@ -17996,7 +17996,7 @@
     </w:p>
     <w:p>
       <w:pPr>
-        <w:spacing w:after="40" w:line="360"/>
+        <w:spacing w:after="40" w:line="240"/>
         <w:jc w:val="both"/>
       </w:pPr>
       <w:r>
@@ -18014,7 +18014,7 @@
     </w:p>
     <w:p>
       <w:pPr>
-        <w:spacing w:after="60" w:line="360"/>
+        <w:spacing w:after="60" w:line="240"/>
         <w:jc w:val="both"/>
       </w:pPr>
       <w:r>
@@ -18319,7 +18319,7 @@
     </w:p>
     <w:p>
       <w:pPr>
-        <w:spacing w:after="40" w:line="360"/>
+        <w:spacing w:after="40" w:line="240"/>
         <w:jc w:val="both"/>
       </w:pPr>
       <w:r>
@@ -18471,7 +18471,7 @@
     </w:p>
     <w:p>
       <w:pPr>
-        <w:spacing w:after="40" w:line="360"/>
+        <w:spacing w:after="40" w:line="240"/>
         <w:jc w:val="both"/>
       </w:pPr>
       <w:r>
@@ -18624,7 +18624,7 @@
     <w:sectPr>
       <w:footerReference w:type="default" r:id="rId7"/>
       <w:pgSz w:w="11906" w:h="16838" w:orient="portrait"/>
-      <w:pgMar w:top="1701" w:right="1134" w:bottom="1134" w:left="1701" w:header="708" w:footer="708" w:gutter="0"/>
+      <w:pgMar w:top="1134" w:right="850" w:bottom="1134" w:left="1701" w:header="708" w:footer="708" w:gutter="0"/>
       <w:pgNumType/>
       <w:docGrid w:linePitch="360"/>
     </w:sectPr>

</xml_diff>